<commit_message>
atualização da procuração: inclusão de clásula de honorários mínimos para causas inferiores a um salário minimo
</commit_message>
<xml_diff>
--- a/app/templates/templates_word/procuracao.docx
+++ b/app/templates/templates_word/procuracao.docx
@@ -33,19 +33,10 @@
           <w:szCs w:val="24"/>
         </w:rPr>
       </w:pPr>
-      <w:r>
-        <w:rPr>
-          <w:rFonts w:ascii="Arial Narrow" w:hAnsi="Arial Narrow" w:cs="Arial"/>
-          <w:b/>
-          <w:sz w:val="24"/>
-          <w:szCs w:val="24"/>
-        </w:rPr>
-        <w:t>PROCURAÇÃO</w:t>
-      </w:r>
     </w:p>
     <w:p>
       <w:pPr>
-        <w:jc w:val="both"/>
+        <w:jc w:val="center"/>
         <w:rPr>
           <w:rFonts w:ascii="Arial Narrow" w:hAnsi="Arial Narrow" w:cs="Arial"/>
           <w:b/>
@@ -53,6 +44,24 @@
           <w:szCs w:val="24"/>
         </w:rPr>
       </w:pPr>
+      <w:r>
+        <w:rPr>
+          <w:rFonts w:ascii="Arial Narrow" w:hAnsi="Arial Narrow" w:cs="Arial"/>
+          <w:b/>
+          <w:sz w:val="24"/>
+          <w:szCs w:val="24"/>
+        </w:rPr>
+        <w:t>PROCURAÇÃO</w:t>
+      </w:r>
+      <w:r>
+        <w:rPr>
+          <w:rFonts w:ascii="Arial Narrow" w:hAnsi="Arial Narrow" w:cs="Arial"/>
+          <w:b/>
+          <w:sz w:val="24"/>
+          <w:szCs w:val="24"/>
+        </w:rPr>
+        <w:t>/CONTRATO DE HONORÁRIOS</w:t>
+      </w:r>
     </w:p>
     <w:p>
       <w:pPr>
@@ -67,6 +76,17 @@
     </w:p>
     <w:p>
       <w:pPr>
+        <w:jc w:val="both"/>
+        <w:rPr>
+          <w:rFonts w:ascii="Arial Narrow" w:hAnsi="Arial Narrow" w:cs="Arial"/>
+          <w:b/>
+          <w:sz w:val="24"/>
+          <w:szCs w:val="24"/>
+        </w:rPr>
+      </w:pPr>
+    </w:p>
+    <w:p>
+      <w:pPr>
         <w:spacing w:after="0"/>
         <w:jc w:val="both"/>
         <w:rPr>
@@ -101,7 +121,107 @@
           <w:sz w:val="24"/>
           <w:szCs w:val="24"/>
         </w:rPr>
-        <w:t xml:space="preserve"> {{estado_civil}}, {{profissao}}, portador(a) da cédula de identidade RG nº {{rg}}, inscrito(a) no CPF sob o nº {{cpf}}, residente e domiciliado(a) à {{endereco}}, telefone {{telefone}}, endereço eletrônico {{email}}.</w:t>
+        <w:t xml:space="preserve"> {{</w:t>
+      </w:r>
+      <w:proofErr w:type="spellStart"/>
+      <w:r>
+        <w:rPr>
+          <w:rFonts w:ascii="Arial Narrow" w:hAnsi="Arial Narrow" w:cs="Arial"/>
+          <w:bCs/>
+          <w:sz w:val="24"/>
+          <w:szCs w:val="24"/>
+        </w:rPr>
+        <w:t>estado_civil</w:t>
+      </w:r>
+      <w:proofErr w:type="spellEnd"/>
+      <w:r>
+        <w:rPr>
+          <w:rFonts w:ascii="Arial Narrow" w:hAnsi="Arial Narrow" w:cs="Arial"/>
+          <w:bCs/>
+          <w:sz w:val="24"/>
+          <w:szCs w:val="24"/>
+        </w:rPr>
+        <w:t>}}, {{</w:t>
+      </w:r>
+      <w:proofErr w:type="spellStart"/>
+      <w:r>
+        <w:rPr>
+          <w:rFonts w:ascii="Arial Narrow" w:hAnsi="Arial Narrow" w:cs="Arial"/>
+          <w:bCs/>
+          <w:sz w:val="24"/>
+          <w:szCs w:val="24"/>
+        </w:rPr>
+        <w:t>profissao</w:t>
+      </w:r>
+      <w:proofErr w:type="spellEnd"/>
+      <w:r>
+        <w:rPr>
+          <w:rFonts w:ascii="Arial Narrow" w:hAnsi="Arial Narrow" w:cs="Arial"/>
+          <w:bCs/>
+          <w:sz w:val="24"/>
+          <w:szCs w:val="24"/>
+        </w:rPr>
+        <w:t>}}, portador(a) da cédula de identidade RG nº {{</w:t>
+      </w:r>
+      <w:proofErr w:type="spellStart"/>
+      <w:r>
+        <w:rPr>
+          <w:rFonts w:ascii="Arial Narrow" w:hAnsi="Arial Narrow" w:cs="Arial"/>
+          <w:bCs/>
+          <w:sz w:val="24"/>
+          <w:szCs w:val="24"/>
+        </w:rPr>
+        <w:t>rg</w:t>
+      </w:r>
+      <w:proofErr w:type="spellEnd"/>
+      <w:r>
+        <w:rPr>
+          <w:rFonts w:ascii="Arial Narrow" w:hAnsi="Arial Narrow" w:cs="Arial"/>
+          <w:bCs/>
+          <w:sz w:val="24"/>
+          <w:szCs w:val="24"/>
+        </w:rPr>
+        <w:t>}}, inscrito(a) no CPF sob o nº {{</w:t>
+      </w:r>
+      <w:proofErr w:type="spellStart"/>
+      <w:r>
+        <w:rPr>
+          <w:rFonts w:ascii="Arial Narrow" w:hAnsi="Arial Narrow" w:cs="Arial"/>
+          <w:bCs/>
+          <w:sz w:val="24"/>
+          <w:szCs w:val="24"/>
+        </w:rPr>
+        <w:t>cpf</w:t>
+      </w:r>
+      <w:proofErr w:type="spellEnd"/>
+      <w:r>
+        <w:rPr>
+          <w:rFonts w:ascii="Arial Narrow" w:hAnsi="Arial Narrow" w:cs="Arial"/>
+          <w:bCs/>
+          <w:sz w:val="24"/>
+          <w:szCs w:val="24"/>
+        </w:rPr>
+        <w:t>}}, residente e domiciliado(a) à {{</w:t>
+      </w:r>
+      <w:proofErr w:type="spellStart"/>
+      <w:r>
+        <w:rPr>
+          <w:rFonts w:ascii="Arial Narrow" w:hAnsi="Arial Narrow" w:cs="Arial"/>
+          <w:bCs/>
+          <w:sz w:val="24"/>
+          <w:szCs w:val="24"/>
+        </w:rPr>
+        <w:t>endereco</w:t>
+      </w:r>
+      <w:proofErr w:type="spellEnd"/>
+      <w:r>
+        <w:rPr>
+          <w:rFonts w:ascii="Arial Narrow" w:hAnsi="Arial Narrow" w:cs="Arial"/>
+          <w:bCs/>
+          <w:sz w:val="24"/>
+          <w:szCs w:val="24"/>
+        </w:rPr>
+        <w:t>}}, telefone {{telefone}}, endereço eletrônico {{email}}.</w:t>
       </w:r>
     </w:p>
     <w:p>
@@ -148,7 +268,23 @@
           <w:rFonts w:ascii="Arial Narrow" w:hAnsi="Arial Narrow" w:cs="Courier New"/>
           <w:bCs/>
         </w:rPr>
-        <w:t xml:space="preserve">, pessoa jurídica de direito privado, inscrita no CNPJ sob nº 56.051.791/0001-33, com sede profissional na Praça Coronel Antonio Pessoa, nº 89, Edifício Misael Tavares, sala 802, Centro, CEP 45.653-410, Ilhéus/BA, endereço eletrônico escritorio@clementinosilvalopesadv.com.br, telefone (73) 9168-2510, bem como seus sócios e advogados: </w:t>
+        <w:t xml:space="preserve">, pessoa jurídica de direito privado, inscrita no CNPJ sob nº 56.051.791/0001-33, com sede profissional na Praça Coronel </w:t>
+      </w:r>
+      <w:proofErr w:type="spellStart"/>
+      <w:r>
+        <w:rPr>
+          <w:rFonts w:ascii="Arial Narrow" w:hAnsi="Arial Narrow" w:cs="Courier New"/>
+          <w:bCs/>
+        </w:rPr>
+        <w:t>Antonio</w:t>
+      </w:r>
+      <w:proofErr w:type="spellEnd"/>
+      <w:r>
+        <w:rPr>
+          <w:rFonts w:ascii="Arial Narrow" w:hAnsi="Arial Narrow" w:cs="Courier New"/>
+          <w:bCs/>
+        </w:rPr>
+        <w:t xml:space="preserve"> Pessoa, nº 89, Edifício Misael Tavares, sala 802, Centro, CEP 45.653-410, Ilhéus/BA, endereço eletrônico escritorio@clementinosilvalopesadv.com.br, telefone (73) 9168-2510, bem como seus sócios e advogados: </w:t>
       </w:r>
       <w:r>
         <w:rPr>
@@ -374,27 +510,86 @@
           <w:sz w:val="22"/>
           <w:szCs w:val="22"/>
         </w:rPr>
-        <w:t xml:space="preserve">Acertam-se, mais as partes a inserção de condição contratual “Ad extium”, restando comprometido e acertado que o CONTRATANTE/OUTORGANTE pagará, em caso de êxito na demanda, seja parcial ou total, ao final da causa, o percentual de </w:t>
-      </w:r>
+        <w:t xml:space="preserve">Acertam-se, mais as partes a inserção de condição contratual “Ad </w:t>
+      </w:r>
+      <w:proofErr w:type="spellStart"/>
       <w:r>
         <w:rPr>
           <w:rFonts w:ascii="Arial Narrow" w:hAnsi="Arial Narrow" w:cs="Times New Roman"/>
           <w:sz w:val="22"/>
           <w:szCs w:val="22"/>
         </w:rPr>
-        <w:t>35</w:t>
-      </w:r>
+        <w:t>extium</w:t>
+      </w:r>
+      <w:proofErr w:type="spellEnd"/>
       <w:r>
         <w:rPr>
           <w:rFonts w:ascii="Arial Narrow" w:hAnsi="Arial Narrow" w:cs="Times New Roman"/>
           <w:sz w:val="22"/>
           <w:szCs w:val="22"/>
         </w:rPr>
+        <w:t xml:space="preserve">”, restando comprometido e acertado que o CONTRATANTE/OUTORGANTE pagará, em caso de êxito na demanda, seja parcial ou total, ao final da causa, o percentual de </w:t>
+      </w:r>
+      <w:r>
+        <w:rPr>
+          <w:rFonts w:ascii="Arial Narrow" w:hAnsi="Arial Narrow" w:cs="Times New Roman"/>
+          <w:sz w:val="22"/>
+          <w:szCs w:val="22"/>
+        </w:rPr>
+        <w:t>35</w:t>
+      </w:r>
+      <w:r>
+        <w:rPr>
+          <w:rFonts w:ascii="Arial Narrow" w:hAnsi="Arial Narrow" w:cs="Times New Roman"/>
+          <w:sz w:val="22"/>
+          <w:szCs w:val="22"/>
+        </w:rPr>
         <w:t>% sobre o proveito econômico auferido.</w:t>
       </w:r>
     </w:p>
     <w:p>
       <w:pPr>
+        <w:pStyle w:val="Default"/>
+        <w:jc w:val="both"/>
+        <w:rPr>
+          <w:rFonts w:ascii="Arial Narrow" w:hAnsi="Arial Narrow" w:cs="Times New Roman"/>
+          <w:sz w:val="22"/>
+          <w:szCs w:val="22"/>
+        </w:rPr>
+      </w:pPr>
+    </w:p>
+    <w:p>
+      <w:pPr>
+        <w:pStyle w:val="Default"/>
+        <w:jc w:val="both"/>
+        <w:rPr>
+          <w:rFonts w:ascii="Arial Narrow" w:hAnsi="Arial Narrow" w:cs="Times New Roman"/>
+          <w:sz w:val="22"/>
+          <w:szCs w:val="22"/>
+        </w:rPr>
+      </w:pPr>
+      <w:r>
+        <w:rPr>
+          <w:rFonts w:ascii="Arial Narrow" w:hAnsi="Arial Narrow" w:cs="Times New Roman"/>
+          <w:b/>
+          <w:bCs/>
+          <w:sz w:val="22"/>
+          <w:szCs w:val="22"/>
+          <w:u w:val="single"/>
+        </w:rPr>
+        <w:t>Parágrafo único:</w:t>
+      </w:r>
+      <w:r>
+        <w:rPr>
+          <w:rFonts w:ascii="Arial Narrow" w:hAnsi="Arial Narrow" w:cs="Times New Roman"/>
+          <w:sz w:val="22"/>
+          <w:szCs w:val="22"/>
+        </w:rPr>
+        <w:t xml:space="preserve"> Fica convencionado entre as partes que, nas demandas cujo proveito econômico obtido seja inferior ao valor de 01 (um) salário mínimo vigente à época do recebimento, o valor integral apurado será destinado ao pagamento dos honorários advocatícios, a título de remuneração mínima pelos serviços prestados.</w:t>
+      </w:r>
+    </w:p>
+    <w:p>
+      <w:pPr>
         <w:spacing w:after="0" w:line="240" w:lineRule="auto"/>
         <w:jc w:val="center"/>
         <w:rPr>
@@ -593,15 +788,18 @@
         <w:spacing w:after="0" w:line="240" w:lineRule="auto"/>
         <w:jc w:val="center"/>
         <w:rPr>
-          <w:rFonts w:ascii="Times New Roman" w:hAnsi="Times New Roman" w:cs="Times New Roman"/>
-          <w:sz w:val="24"/>
-          <w:szCs w:val="24"/>
-        </w:rPr>
-      </w:pPr>
-      <w:r>
-        <w:rPr>
-          <w:rFonts w:ascii="Arial Narrow" w:hAnsi="Arial Narrow"/>
-          <w:noProof/>
+          <w:rFonts w:ascii="Arial Narrow" w:hAnsi="Arial Narrow" w:cs="Arial"/>
+          <w:b/>
+          <w:sz w:val="24"/>
+          <w:szCs w:val="24"/>
+        </w:rPr>
+      </w:pPr>
+      <w:r>
+        <w:rPr>
+          <w:rFonts w:ascii="Arial Narrow" w:hAnsi="Arial Narrow" w:cs="Arial"/>
+          <w:b/>
+          <w:sz w:val="24"/>
+          <w:szCs w:val="24"/>
         </w:rPr>
         <mc:AlternateContent>
           <mc:Choice Requires="wps">
@@ -719,12 +917,30 @@
       </w:r>
       <w:r>
         <w:rPr>
-          <w:rFonts w:ascii="Times New Roman" w:eastAsia="Times New Roman" w:hAnsi="Times New Roman" w:cs="Times New Roman"/>
+          <w:rFonts w:ascii="Arial Narrow" w:hAnsi="Arial Narrow" w:cs="Arial"/>
           <w:b/>
           <w:sz w:val="24"/>
           <w:szCs w:val="24"/>
         </w:rPr>
         <w:t>ASSINATURA</w:t>
+      </w:r>
+      <w:r>
+        <w:rPr>
+          <w:rFonts w:ascii="Arial Narrow" w:hAnsi="Arial Narrow" w:cs="Arial"/>
+          <w:b/>
+          <w:sz w:val="24"/>
+          <w:szCs w:val="24"/>
+        </w:rPr>
+        <w:t xml:space="preserve"> </w:t>
+      </w:r>
+      <w:r>
+        <w:rPr>
+          <w:rFonts w:ascii="Arial Narrow" w:hAnsi="Arial Narrow" w:cs="Arial"/>
+          <w:b/>
+          <w:sz w:val="24"/>
+          <w:szCs w:val="24"/>
+        </w:rPr>
+        <w:t>OUTORGANTE</w:t>
       </w:r>
     </w:p>
     <w:sectPr>
@@ -1935,7 +2151,7 @@
         </mc:Choice>
         <mc:Fallback>
           <w:pict>
-            <v:group w14:anchorId="3CE4C7F1" id="Agrupar 5" o:spid="_x0000_s1026" style="position:absolute;margin-left:-.2pt;margin-top:-34.9pt;width:595.25pt;height:72.85pt;z-index:251659264;mso-position-horizontal-relative:page" coordsize="75596,9251" o:gfxdata="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">
+            <v:group w14:anchorId="096AE671" id="Agrupar 5" o:spid="_x0000_s1026" style="position:absolute;margin-left:-.2pt;margin-top:-34.9pt;width:595.25pt;height:72.85pt;z-index:251659264;mso-position-horizontal-relative:page" coordsize="75596,9251" o:gfxdata="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">
               <v:shapetype id="_x0000_t75" coordsize="21600,21600" o:spt="75" o:preferrelative="t" path="m@4@5l@4@11@9@11@9@5xe" filled="f" stroked="f">
                 <v:stroke joinstyle="miter"/>
                 <v:formulas>
@@ -2624,7 +2840,6 @@
   <w:style w:type="character" w:default="1" w:styleId="Fontepargpadro">
     <w:name w:val="Default Paragraph Font"/>
     <w:uiPriority w:val="1"/>
-    <w:semiHidden/>
     <w:unhideWhenUsed/>
   </w:style>
   <w:style w:type="table" w:default="1" w:styleId="Tabelanormal">

</xml_diff>

<commit_message>
Atualização da procuração: inclusão de clásula de honorários minimos para causas inferiores a meio salário minimo
</commit_message>
<xml_diff>
--- a/app/templates/templates_word/procuracao.docx
+++ b/app/templates/templates_word/procuracao.docx
@@ -121,107 +121,7 @@
           <w:sz w:val="24"/>
           <w:szCs w:val="24"/>
         </w:rPr>
-        <w:t xml:space="preserve"> {{</w:t>
-      </w:r>
-      <w:proofErr w:type="spellStart"/>
-      <w:r>
-        <w:rPr>
-          <w:rFonts w:ascii="Arial Narrow" w:hAnsi="Arial Narrow" w:cs="Arial"/>
-          <w:bCs/>
-          <w:sz w:val="24"/>
-          <w:szCs w:val="24"/>
-        </w:rPr>
-        <w:t>estado_civil</w:t>
-      </w:r>
-      <w:proofErr w:type="spellEnd"/>
-      <w:r>
-        <w:rPr>
-          <w:rFonts w:ascii="Arial Narrow" w:hAnsi="Arial Narrow" w:cs="Arial"/>
-          <w:bCs/>
-          <w:sz w:val="24"/>
-          <w:szCs w:val="24"/>
-        </w:rPr>
-        <w:t>}}, {{</w:t>
-      </w:r>
-      <w:proofErr w:type="spellStart"/>
-      <w:r>
-        <w:rPr>
-          <w:rFonts w:ascii="Arial Narrow" w:hAnsi="Arial Narrow" w:cs="Arial"/>
-          <w:bCs/>
-          <w:sz w:val="24"/>
-          <w:szCs w:val="24"/>
-        </w:rPr>
-        <w:t>profissao</w:t>
-      </w:r>
-      <w:proofErr w:type="spellEnd"/>
-      <w:r>
-        <w:rPr>
-          <w:rFonts w:ascii="Arial Narrow" w:hAnsi="Arial Narrow" w:cs="Arial"/>
-          <w:bCs/>
-          <w:sz w:val="24"/>
-          <w:szCs w:val="24"/>
-        </w:rPr>
-        <w:t>}}, portador(a) da cédula de identidade RG nº {{</w:t>
-      </w:r>
-      <w:proofErr w:type="spellStart"/>
-      <w:r>
-        <w:rPr>
-          <w:rFonts w:ascii="Arial Narrow" w:hAnsi="Arial Narrow" w:cs="Arial"/>
-          <w:bCs/>
-          <w:sz w:val="24"/>
-          <w:szCs w:val="24"/>
-        </w:rPr>
-        <w:t>rg</w:t>
-      </w:r>
-      <w:proofErr w:type="spellEnd"/>
-      <w:r>
-        <w:rPr>
-          <w:rFonts w:ascii="Arial Narrow" w:hAnsi="Arial Narrow" w:cs="Arial"/>
-          <w:bCs/>
-          <w:sz w:val="24"/>
-          <w:szCs w:val="24"/>
-        </w:rPr>
-        <w:t>}}, inscrito(a) no CPF sob o nº {{</w:t>
-      </w:r>
-      <w:proofErr w:type="spellStart"/>
-      <w:r>
-        <w:rPr>
-          <w:rFonts w:ascii="Arial Narrow" w:hAnsi="Arial Narrow" w:cs="Arial"/>
-          <w:bCs/>
-          <w:sz w:val="24"/>
-          <w:szCs w:val="24"/>
-        </w:rPr>
-        <w:t>cpf</w:t>
-      </w:r>
-      <w:proofErr w:type="spellEnd"/>
-      <w:r>
-        <w:rPr>
-          <w:rFonts w:ascii="Arial Narrow" w:hAnsi="Arial Narrow" w:cs="Arial"/>
-          <w:bCs/>
-          <w:sz w:val="24"/>
-          <w:szCs w:val="24"/>
-        </w:rPr>
-        <w:t>}}, residente e domiciliado(a) à {{</w:t>
-      </w:r>
-      <w:proofErr w:type="spellStart"/>
-      <w:r>
-        <w:rPr>
-          <w:rFonts w:ascii="Arial Narrow" w:hAnsi="Arial Narrow" w:cs="Arial"/>
-          <w:bCs/>
-          <w:sz w:val="24"/>
-          <w:szCs w:val="24"/>
-        </w:rPr>
-        <w:t>endereco</w:t>
-      </w:r>
-      <w:proofErr w:type="spellEnd"/>
-      <w:r>
-        <w:rPr>
-          <w:rFonts w:ascii="Arial Narrow" w:hAnsi="Arial Narrow" w:cs="Arial"/>
-          <w:bCs/>
-          <w:sz w:val="24"/>
-          <w:szCs w:val="24"/>
-        </w:rPr>
-        <w:t>}}, telefone {{telefone}}, endereço eletrônico {{email}}.</w:t>
+        <w:t xml:space="preserve"> {{estado_civil}}, {{profissao}}, portador(a) da cédula de identidade RG nº {{rg}}, inscrito(a) no CPF sob o nº {{cpf}}, residente e domiciliado(a) à {{endereco}}, telefone {{telefone}}, endereço eletrônico {{email}}.</w:t>
       </w:r>
     </w:p>
     <w:p>
@@ -268,23 +168,7 @@
           <w:rFonts w:ascii="Arial Narrow" w:hAnsi="Arial Narrow" w:cs="Courier New"/>
           <w:bCs/>
         </w:rPr>
-        <w:t xml:space="preserve">, pessoa jurídica de direito privado, inscrita no CNPJ sob nº 56.051.791/0001-33, com sede profissional na Praça Coronel </w:t>
-      </w:r>
-      <w:proofErr w:type="spellStart"/>
-      <w:r>
-        <w:rPr>
-          <w:rFonts w:ascii="Arial Narrow" w:hAnsi="Arial Narrow" w:cs="Courier New"/>
-          <w:bCs/>
-        </w:rPr>
-        <w:t>Antonio</w:t>
-      </w:r>
-      <w:proofErr w:type="spellEnd"/>
-      <w:r>
-        <w:rPr>
-          <w:rFonts w:ascii="Arial Narrow" w:hAnsi="Arial Narrow" w:cs="Courier New"/>
-          <w:bCs/>
-        </w:rPr>
-        <w:t xml:space="preserve"> Pessoa, nº 89, Edifício Misael Tavares, sala 802, Centro, CEP 45.653-410, Ilhéus/BA, endereço eletrônico escritorio@clementinosilvalopesadv.com.br, telefone (73) 9168-2510, bem como seus sócios e advogados: </w:t>
+        <w:t xml:space="preserve">, pessoa jurídica de direito privado, inscrita no CNPJ sob nº 56.051.791/0001-33, com sede profissional na Praça Coronel Antonio Pessoa, nº 89, Edifício Misael Tavares, sala 802, Centro, CEP 45.653-410, Ilhéus/BA, endereço eletrônico escritorio@clementinosilvalopesadv.com.br, telefone (73) 9168-2510, bem como seus sócios e advogados: </w:t>
       </w:r>
       <w:r>
         <w:rPr>
@@ -510,25 +394,7 @@
           <w:sz w:val="22"/>
           <w:szCs w:val="22"/>
         </w:rPr>
-        <w:t xml:space="preserve">Acertam-se, mais as partes a inserção de condição contratual “Ad </w:t>
-      </w:r>
-      <w:proofErr w:type="spellStart"/>
-      <w:r>
-        <w:rPr>
-          <w:rFonts w:ascii="Arial Narrow" w:hAnsi="Arial Narrow" w:cs="Times New Roman"/>
-          <w:sz w:val="22"/>
-          <w:szCs w:val="22"/>
-        </w:rPr>
-        <w:t>extium</w:t>
-      </w:r>
-      <w:proofErr w:type="spellEnd"/>
-      <w:r>
-        <w:rPr>
-          <w:rFonts w:ascii="Arial Narrow" w:hAnsi="Arial Narrow" w:cs="Times New Roman"/>
-          <w:sz w:val="22"/>
-          <w:szCs w:val="22"/>
-        </w:rPr>
-        <w:t xml:space="preserve">”, restando comprometido e acertado que o CONTRATANTE/OUTORGANTE pagará, em caso de êxito na demanda, seja parcial ou total, ao final da causa, o percentual de </w:t>
+        <w:t xml:space="preserve">Acertam-se, mais as partes a inserção de condição contratual “Ad extium”, restando comprometido e acertado que o CONTRATANTE/OUTORGANTE pagará, em caso de êxito na demanda, seja parcial ou total, ao final da causa, o percentual de </w:t>
       </w:r>
       <w:r>
         <w:rPr>
@@ -585,7 +451,23 @@
           <w:sz w:val="22"/>
           <w:szCs w:val="22"/>
         </w:rPr>
-        <w:t xml:space="preserve"> Fica convencionado entre as partes que, nas demandas cujo proveito econômico obtido seja inferior ao valor de 01 (um) salário mínimo vigente à época do recebimento, o valor integral apurado será destinado ao pagamento dos honorários advocatícios, a título de remuneração mínima pelos serviços prestados.</w:t>
+        <w:t xml:space="preserve"> Fica convencionado entre as partes que, nas demandas cujo proveito econômico obtido seja inferior </w:t>
+      </w:r>
+      <w:r>
+        <w:rPr>
+          <w:rFonts w:ascii="Arial Narrow" w:hAnsi="Arial Narrow" w:cs="Times New Roman"/>
+          <w:sz w:val="22"/>
+          <w:szCs w:val="22"/>
+        </w:rPr>
+        <w:t>a meio</w:t>
+      </w:r>
+      <w:r>
+        <w:rPr>
+          <w:rFonts w:ascii="Arial Narrow" w:hAnsi="Arial Narrow" w:cs="Times New Roman"/>
+          <w:sz w:val="22"/>
+          <w:szCs w:val="22"/>
+        </w:rPr>
+        <w:t xml:space="preserve"> salário mínimo vigente à época do recebimento, o valor integral apurado será destinado ao pagamento dos honorários advocatícios, a título de remuneração mínima pelos serviços prestados.</w:t>
       </w:r>
     </w:p>
     <w:p>
@@ -798,6 +680,7 @@
         <w:rPr>
           <w:rFonts w:ascii="Arial Narrow" w:hAnsi="Arial Narrow" w:cs="Arial"/>
           <w:b/>
+          <w:noProof/>
           <w:sz w:val="24"/>
           <w:szCs w:val="24"/>
         </w:rPr>
@@ -2151,7 +2034,7 @@
         </mc:Choice>
         <mc:Fallback>
           <w:pict>
-            <v:group w14:anchorId="096AE671" id="Agrupar 5" o:spid="_x0000_s1026" style="position:absolute;margin-left:-.2pt;margin-top:-34.9pt;width:595.25pt;height:72.85pt;z-index:251659264;mso-position-horizontal-relative:page" coordsize="75596,9251" o:gfxdata="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">
+            <v:group w14:anchorId="54D94E40" id="Agrupar 5" o:spid="_x0000_s1026" style="position:absolute;margin-left:-.2pt;margin-top:-34.9pt;width:595.25pt;height:72.85pt;z-index:251659264;mso-position-horizontal-relative:page" coordsize="75596,9251" o:gfxdata="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">
               <v:shapetype id="_x0000_t75" coordsize="21600,21600" o:spt="75" o:preferrelative="t" path="m@4@5l@4@11@9@11@9@5xe" filled="f" stroked="f">
                 <v:stroke joinstyle="miter"/>
                 <v:formulas>
@@ -2840,6 +2723,7 @@
   <w:style w:type="character" w:default="1" w:styleId="Fontepargpadro">
     <w:name w:val="Default Paragraph Font"/>
     <w:uiPriority w:val="1"/>
+    <w:semiHidden/>
     <w:unhideWhenUsed/>
   </w:style>
   <w:style w:type="table" w:default="1" w:styleId="Tabelanormal">

</xml_diff>